<commit_message>
maj schéma, contexte P2
</commit_message>
<xml_diff>
--- a/Claude outputs/MD_Fiche_programme_P2.docx
+++ b/Claude outputs/MD_Fiche_programme_P2.docx
@@ -295,7 +295,7 @@
               </w:rPr>
               <w:t xml:space="preserve">Document stratégique de façade (DSF) Méditerranée, objectifs A et C, et descripteurs du bon état écologique (DCSMM) ; </w:t>
             </w:r>
-            <w:hyperlink w:history="1" r:id="rIdydofylepgno3lfth5y5pc">
+            <w:hyperlink w:history="1" r:id="rIdiw0piilrd17sqamlolqj2">
               <w:r>
                 <w:rPr>
                   <w:rFonts w:ascii="Calibri" w:cs="Calibri" w:eastAsia="Calibri" w:hAnsi="Calibri"/>
@@ -315,7 +315,7 @@
               </w:rPr>
               <w:t xml:space="preserve"> (DIRM, 2019) ; </w:t>
             </w:r>
-            <w:hyperlink w:history="1" r:id="rIdeqju0qnm5xmatue8jmyod">
+            <w:hyperlink w:history="1" r:id="rIdifkng-exfieh6logvekut">
               <w:r>
                 <w:rPr>
                   <w:rFonts w:ascii="Calibri" w:cs="Calibri" w:eastAsia="Calibri" w:hAnsi="Calibri"/>
@@ -335,7 +335,7 @@
               </w:rPr>
               <w:t xml:space="preserve"> (2012) ; </w:t>
             </w:r>
-            <w:hyperlink w:history="1" r:id="rIdwrewi9c-em6o3qrjqjpd4">
+            <w:hyperlink w:history="1" r:id="rIdqqwrk7eanltwkofw27llu">
               <w:r>
                 <w:rPr>
                   <w:rFonts w:ascii="Calibri" w:cs="Calibri" w:eastAsia="Calibri" w:hAnsi="Calibri"/>
@@ -1083,7 +1083,7 @@
             <w:pPr>
               <w:spacing w:after="20"/>
             </w:pPr>
-            <w:hyperlink w:history="1" r:id="rIdo2ola6vudnftwxuoamdbz">
+            <w:hyperlink w:history="1" r:id="rId7x_uzdseydbchejevzklw">
               <w:r>
                 <w:rPr>
                   <w:rFonts w:ascii="Calibri" w:cs="Calibri" w:eastAsia="Calibri" w:hAnsi="Calibri"/>
@@ -1103,7 +1103,7 @@
               </w:rPr>
               <w:t xml:space="preserve"> · descripteurs D1, D3, D6 · état écologique à l’</w:t>
             </w:r>
-            <w:hyperlink w:history="1" r:id="rIdzqq1fggj4l6oaqnf0mdd8">
+            <w:hyperlink w:history="1" r:id="rId_hmwn_53tv9x0qinqgx6d">
               <w:r>
                 <w:rPr>
                   <w:rFonts w:ascii="Calibri" w:cs="Calibri" w:eastAsia="Calibri" w:hAnsi="Calibri"/>
@@ -1123,7 +1123,7 @@
               </w:rPr>
               <w:t xml:space="preserve"> · </w:t>
             </w:r>
-            <w:hyperlink w:history="1" r:id="rIdbhue0h9isqgan2af5qbeg">
+            <w:hyperlink w:history="1" r:id="rId-10o585laquygghy2a8t3">
               <w:r>
                 <w:rPr>
                   <w:rFonts w:ascii="Calibri" w:cs="Calibri" w:eastAsia="Calibri" w:hAnsi="Calibri"/>
@@ -1271,7 +1271,7 @@
             <w:pPr>
               <w:spacing w:after="20"/>
             </w:pPr>
-            <w:hyperlink w:history="1" r:id="rIdb7ty8q558qet5rtc9onby">
+            <w:hyperlink w:history="1" r:id="rIdxtrhuxycwdiq8udmht1b5">
               <w:r>
                 <w:rPr>
                   <w:rFonts w:ascii="Calibri" w:cs="Calibri" w:eastAsia="Calibri" w:hAnsi="Calibri"/>
@@ -1291,7 +1291,7 @@
               </w:rPr>
               <w:t xml:space="preserve"> · socio-économiques O, K, M · descripteurs D1, D3, D4, D6 · </w:t>
             </w:r>
-            <w:hyperlink w:history="1" r:id="rIdbmjfp4cpwtjhetobgikm4">
+            <w:hyperlink w:history="1" r:id="rIdqfs4df9_dq94rlgkr-v8h">
               <w:r>
                 <w:rPr>
                   <w:rFonts w:ascii="Calibri" w:cs="Calibri" w:eastAsia="Calibri" w:hAnsi="Calibri"/>
@@ -1311,7 +1311,7 @@
               </w:rPr>
               <w:t xml:space="preserve"> · </w:t>
             </w:r>
-            <w:hyperlink w:history="1" r:id="rIdcayvcfdig7ksf0knqqoaq">
+            <w:hyperlink w:history="1" r:id="rIdh86jni-d9ssgdxugo-kka">
               <w:r>
                 <w:rPr>
                   <w:rFonts w:ascii="Calibri" w:cs="Calibri" w:eastAsia="Calibri" w:hAnsi="Calibri"/>
@@ -1459,7 +1459,7 @@
             <w:pPr>
               <w:spacing w:after="20"/>
             </w:pPr>
-            <w:hyperlink w:history="1" r:id="rIdn-bsdthw5xzu4zvxxmftw">
+            <w:hyperlink w:history="1" r:id="rIdn_hlxonw9b3n8lbxz-zmr">
               <w:r>
                 <w:rPr>
                   <w:rFonts w:ascii="Calibri" w:cs="Calibri" w:eastAsia="Calibri" w:hAnsi="Calibri"/>
@@ -3030,7 +3030,7 @@
                 <w:sz w:val="18"/>
                 <w:szCs w:val="18"/>
               </w:rPr>
-              <w:t xml:space="preserve">Nous agissons en propre, sur cahier des charges, lorsque :</w:t>
+              <w:t xml:space="preserve">Nous passons par un appel à projets lorsque :</w:t>
             </w:r>
           </w:p>
         </w:tc>
@@ -3067,7 +3067,7 @@
                 <w:sz w:val="18"/>
                 <w:szCs w:val="18"/>
               </w:rPr>
-              <w:t xml:space="preserve">Nous passons par un appel à projets lorsque :</w:t>
+              <w:t xml:space="preserve">Nous agissons en propre, sur cahier des charges, lorsque :</w:t>
             </w:r>
           </w:p>
         </w:tc>
@@ -3090,6 +3090,20 @@
             </w:tcMar>
             <w:vAlign w:val="top"/>
           </w:tcPr>
+          <w:p>
+            <w:pPr>
+              <w:spacing w:after="60"/>
+              <w:jc w:val="left"/>
+            </w:pPr>
+            <w:r>
+              <w:rPr>
+                <w:rFonts w:ascii="Calibri" w:cs="Calibri" w:eastAsia="Calibri" w:hAnsi="Calibri"/>
+                <w:sz w:val="18"/>
+                <w:szCs w:val="18"/>
+              </w:rPr>
+              <w:t xml:space="preserve">Dès que le conseil d’administration engage un programme d’action, Mare Durabilis publie un appel à projets. Il ouvre le programme à tous les bénéficiaires éligibles, met les propositions en concurrence et permet de faire émerger plusieurs solutions à un même besoin. Chaque dossier est examiné par les comités consultatifs, puis soumis à la décision du conseil d’administration.</w:t>
+            </w:r>
+          </w:p>
           <w:p>
             <w:pPr>
               <w:pStyle w:val="ListParagraph"/>
@@ -3106,7 +3120,7 @@
                 <w:sz w:val="18"/>
                 <w:szCs w:val="18"/>
               </w:rPr>
-              <w:t xml:space="preserve">Aucun opérateur ne répond au besoin de la filière.</w:t>
+              <w:t xml:space="preserve">Le besoin appelle plusieurs solutions, et l’appel à projets permet de les explorer.</w:t>
             </w:r>
           </w:p>
           <w:p>
@@ -3125,7 +3139,7 @@
                 <w:sz w:val="18"/>
                 <w:szCs w:val="18"/>
               </w:rPr>
-              <w:t xml:space="preserve">Les données produites doivent rester la propriété de l’écosystème Mare Durabilis, et aucun opérateur n’accepte de s’y engager.</w:t>
+              <w:t xml:space="preserve">Le projet comporte un risque technique, financier ou opérationnel que la fondation n’a pas vocation à porter directement.</w:t>
             </w:r>
           </w:p>
           <w:p>
@@ -3144,7 +3158,7 @@
                 <w:sz w:val="18"/>
                 <w:szCs w:val="18"/>
               </w:rPr>
-              <w:t xml:space="preserve">Un candidat est déjà identifié, capable de répondre au besoin, et le conseil d’administration le juge le mieux placé pour réaliser le projet. La décision est motivée, prise après avis des comités consultatifs, et la règle de déport s’applique.</w:t>
+              <w:t xml:space="preserve">Le porteur apporte un cofinancement ou un effet de levier supérieur à ce que la fondation obtiendrait seule.</w:t>
             </w:r>
           </w:p>
           <w:p>
@@ -3163,7 +3177,39 @@
                 <w:sz w:val="18"/>
                 <w:szCs w:val="18"/>
               </w:rPr>
-              <w:t xml:space="preserve">Le besoin concerne l’ensemble de la filière et suppose une mise en commun qu’aucun opérateur ne peut porter seul.</w:t>
+              <w:t xml:space="preserve">L’action relève d’un métier ou d’une compétence réglementée que la fondation n’exerce pas.</w:t>
+            </w:r>
+          </w:p>
+        </w:tc>
+        <w:tc>
+          <w:tcPr>
+            <w:tcW w:type="dxa" w:w="4932"/>
+            <w:tcBorders>
+              <w:top w:val="single" w:color="C9D3E6" w:sz="4"/>
+              <w:left w:val="single" w:color="C9D3E6" w:sz="4"/>
+              <w:bottom w:val="single" w:color="C9D3E6" w:sz="4"/>
+              <w:right w:val="single" w:color="C9D3E6" w:sz="4"/>
+            </w:tcBorders>
+            <w:tcMar>
+              <w:top w:type="dxa" w:w="40"/>
+              <w:left w:type="dxa" w:w="100"/>
+              <w:bottom w:type="dxa" w:w="40"/>
+              <w:right w:type="dxa" w:w="100"/>
+            </w:tcMar>
+            <w:vAlign w:val="top"/>
+          </w:tcPr>
+          <w:p>
+            <w:pPr>
+              <w:spacing w:after="60"/>
+              <w:jc w:val="left"/>
+            </w:pPr>
+            <w:r>
+              <w:rPr>
+                <w:rFonts w:ascii="Calibri" w:cs="Calibri" w:eastAsia="Calibri" w:hAnsi="Calibri"/>
+                <w:sz w:val="18"/>
+                <w:szCs w:val="18"/>
+              </w:rPr>
+              <w:t xml:space="preserve">En parallèle de l’appel à projets, Mare Durabilis peut décider de mener elle-même un projet. Elle rédige alors un cahier des charges et sélectionne le partenaire qui co-mènera le projet avec elle. Nous faisons ce choix notamment lorsque :</w:t>
             </w:r>
           </w:p>
           <w:p>
@@ -3182,7 +3228,7 @@
                 <w:sz w:val="18"/>
                 <w:szCs w:val="18"/>
               </w:rPr>
-              <w:t xml:space="preserve">L’action s’inscrit dans la durée : la production de séries longues exige un pilotage stable, que des projets successifs de durée limitée ne garantissent pas.</w:t>
+              <w:t xml:space="preserve">Aucun opérateur ne répond au besoin identifié par Mare Durabilis.</w:t>
             </w:r>
           </w:p>
           <w:p>
@@ -3201,7 +3247,7 @@
                 <w:sz w:val="18"/>
                 <w:szCs w:val="18"/>
               </w:rPr>
-              <w:t xml:space="preserve">La cohérence entre projets exige que la fondation maîtrise elle-même la méthode : protocoles communs, formats de données, comparabilité des résultats.</w:t>
+              <w:t xml:space="preserve">Les données produites doivent rester la propriété de l’écosystème Mare Durabilis, et aucun opérateur n’accepte de s’y engager.</w:t>
             </w:r>
           </w:p>
           <w:p>
@@ -3220,7 +3266,7 @@
                 <w:sz w:val="18"/>
                 <w:szCs w:val="18"/>
               </w:rPr>
-              <w:t xml:space="preserve">Les pêcheurs sont les principaux exécutants de l’action, dans le cadre de missions rémunérées organisées par la fondation.</w:t>
+              <w:t xml:space="preserve">Un candidat est déjà identifié, capable de répondre au besoin, et le conseil d’administration le juge le mieux placé pour réaliser le projet.</w:t>
             </w:r>
           </w:p>
           <w:p>
@@ -3239,7 +3285,7 @@
                 <w:sz w:val="18"/>
                 <w:szCs w:val="18"/>
               </w:rPr>
-              <w:t xml:space="preserve">L’urgence d’une situation impose une réponse incompatible avec les délais d’un appel à projets.</w:t>
+              <w:t xml:space="preserve">Les pêcheurs sont les principaux exécutants de l’action, dans le cadre de missions rémunérées organisées par la fondation.</w:t>
             </w:r>
           </w:p>
           <w:p>
@@ -3258,196 +3304,7 @@
                 <w:sz w:val="18"/>
                 <w:szCs w:val="18"/>
               </w:rPr>
-              <w:t xml:space="preserve">Les résultats doivent pouvoir être présentés aux autorités et aux tiers comme établis en toute indépendance.</w:t>
-            </w:r>
-          </w:p>
-          <w:p>
-            <w:pPr>
-              <w:pStyle w:val="ListParagraph"/>
-              <w:numPr>
-                <w:ilvl w:val="0"/>
-                <w:numId w:val="2"/>
-              </w:numPr>
-              <w:spacing w:after="20"/>
-              <w:jc w:val="left"/>
-            </w:pPr>
-            <w:r>
-              <w:rPr>
-                <w:rFonts w:ascii="Calibri" w:cs="Calibri" w:eastAsia="Calibri" w:hAnsi="Calibri"/>
-                <w:sz w:val="18"/>
-                <w:szCs w:val="18"/>
-              </w:rPr>
-              <w:t xml:space="preserve">Le montant ou le caractère ponctuel de l’action ne justifie pas le coût d’une procédure d’appel à projets.</w:t>
-            </w:r>
-          </w:p>
-        </w:tc>
-        <w:tc>
-          <w:tcPr>
-            <w:tcW w:type="dxa" w:w="4932"/>
-            <w:tcBorders>
-              <w:top w:val="single" w:color="C9D3E6" w:sz="4"/>
-              <w:left w:val="single" w:color="C9D3E6" w:sz="4"/>
-              <w:bottom w:val="single" w:color="C9D3E6" w:sz="4"/>
-              <w:right w:val="single" w:color="C9D3E6" w:sz="4"/>
-            </w:tcBorders>
-            <w:tcMar>
-              <w:top w:type="dxa" w:w="40"/>
-              <w:left w:type="dxa" w:w="100"/>
-              <w:bottom w:type="dxa" w:w="40"/>
-              <w:right w:type="dxa" w:w="100"/>
-            </w:tcMar>
-            <w:vAlign w:val="top"/>
-          </w:tcPr>
-          <w:p>
-            <w:pPr>
-              <w:pStyle w:val="ListParagraph"/>
-              <w:numPr>
-                <w:ilvl w:val="0"/>
-                <w:numId w:val="2"/>
-              </w:numPr>
-              <w:spacing w:after="20"/>
-              <w:jc w:val="left"/>
-            </w:pPr>
-            <w:r>
-              <w:rPr>
-                <w:rFonts w:ascii="Calibri" w:cs="Calibri" w:eastAsia="Calibri" w:hAnsi="Calibri"/>
-                <w:sz w:val="18"/>
-                <w:szCs w:val="18"/>
-              </w:rPr>
-              <w:t xml:space="preserve">Des opérateurs compétents existent et peuvent porter le besoin : la mise en concurrence est alors possible, et préférable.</w:t>
-            </w:r>
-          </w:p>
-          <w:p>
-            <w:pPr>
-              <w:pStyle w:val="ListParagraph"/>
-              <w:numPr>
-                <w:ilvl w:val="0"/>
-                <w:numId w:val="2"/>
-              </w:numPr>
-              <w:spacing w:after="20"/>
-              <w:jc w:val="left"/>
-            </w:pPr>
-            <w:r>
-              <w:rPr>
-                <w:rFonts w:ascii="Calibri" w:cs="Calibri" w:eastAsia="Calibri" w:hAnsi="Calibri"/>
-                <w:sz w:val="18"/>
-                <w:szCs w:val="18"/>
-              </w:rPr>
-              <w:t xml:space="preserve">La propriété des données et des livrables peut être garantie à l’écosystème par contrat.</w:t>
-            </w:r>
-          </w:p>
-          <w:p>
-            <w:pPr>
-              <w:pStyle w:val="ListParagraph"/>
-              <w:numPr>
-                <w:ilvl w:val="0"/>
-                <w:numId w:val="2"/>
-              </w:numPr>
-              <w:spacing w:after="20"/>
-              <w:jc w:val="left"/>
-            </w:pPr>
-            <w:r>
-              <w:rPr>
-                <w:rFonts w:ascii="Calibri" w:cs="Calibri" w:eastAsia="Calibri" w:hAnsi="Calibri"/>
-                <w:sz w:val="18"/>
-                <w:szCs w:val="18"/>
-              </w:rPr>
-              <w:t xml:space="preserve">Le besoin appelle plusieurs solutions, et l’appel à projets permet de les explorer.</w:t>
-            </w:r>
-          </w:p>
-          <w:p>
-            <w:pPr>
-              <w:pStyle w:val="ListParagraph"/>
-              <w:numPr>
-                <w:ilvl w:val="0"/>
-                <w:numId w:val="2"/>
-              </w:numPr>
-              <w:spacing w:after="20"/>
-              <w:jc w:val="left"/>
-            </w:pPr>
-            <w:r>
-              <w:rPr>
-                <w:rFonts w:ascii="Calibri" w:cs="Calibri" w:eastAsia="Calibri" w:hAnsi="Calibri"/>
-                <w:sz w:val="18"/>
-                <w:szCs w:val="18"/>
-              </w:rPr>
-              <w:t xml:space="preserve">Le projet comporte un risque technique, financier ou opérationnel que la fondation n’a pas vocation à porter directement.</w:t>
-            </w:r>
-          </w:p>
-          <w:p>
-            <w:pPr>
-              <w:pStyle w:val="ListParagraph"/>
-              <w:numPr>
-                <w:ilvl w:val="0"/>
-                <w:numId w:val="2"/>
-              </w:numPr>
-              <w:spacing w:after="20"/>
-              <w:jc w:val="left"/>
-            </w:pPr>
-            <w:r>
-              <w:rPr>
-                <w:rFonts w:ascii="Calibri" w:cs="Calibri" w:eastAsia="Calibri" w:hAnsi="Calibri"/>
-                <w:sz w:val="18"/>
-                <w:szCs w:val="18"/>
-              </w:rPr>
-              <w:t xml:space="preserve">Le porteur apporte un cofinancement ou un effet de levier supérieur à ce que la fondation obtiendrait seule.</w:t>
-            </w:r>
-          </w:p>
-          <w:p>
-            <w:pPr>
-              <w:pStyle w:val="ListParagraph"/>
-              <w:numPr>
-                <w:ilvl w:val="0"/>
-                <w:numId w:val="2"/>
-              </w:numPr>
-              <w:spacing w:after="20"/>
-              <w:jc w:val="left"/>
-            </w:pPr>
-            <w:r>
-              <w:rPr>
-                <w:rFonts w:ascii="Calibri" w:cs="Calibri" w:eastAsia="Calibri" w:hAnsi="Calibri"/>
-                <w:sz w:val="18"/>
-                <w:szCs w:val="18"/>
-              </w:rPr>
-              <w:t xml:space="preserve">L’action relève d’un métier ou d’une compétence réglementée que la fondation n’exerce pas.</w:t>
-            </w:r>
-          </w:p>
-          <w:p>
-            <w:pPr>
-              <w:pStyle w:val="ListParagraph"/>
-              <w:numPr>
-                <w:ilvl w:val="0"/>
-                <w:numId w:val="2"/>
-              </w:numPr>
-              <w:spacing w:after="20"/>
-              <w:jc w:val="left"/>
-            </w:pPr>
-            <w:r>
-              <w:rPr>
-                <w:rFonts w:ascii="Calibri" w:cs="Calibri" w:eastAsia="Calibri" w:hAnsi="Calibri"/>
-                <w:sz w:val="18"/>
-                <w:szCs w:val="18"/>
-              </w:rPr>
-              <w:t xml:space="preserve">Le besoin est ouvert, et les idées doivent venir du terrain et des porteurs plutôt que de la fondation.</w:t>
-            </w:r>
-          </w:p>
-          <w:p>
-            <w:pPr>
-              <w:pStyle w:val="ListParagraph"/>
-              <w:numPr>
-                <w:ilvl w:val="0"/>
-                <w:numId w:val="2"/>
-              </w:numPr>
-              <w:spacing w:after="20"/>
-              <w:jc w:val="left"/>
-            </w:pPr>
-            <w:r>
-              <w:rPr>
-                <w:rFonts w:ascii="Calibri" w:cs="Calibri" w:eastAsia="Calibri" w:hAnsi="Calibri"/>
-                <w:sz w:val="18"/>
-                <w:szCs w:val="18"/>
-              </w:rPr>
-              <w:t xml:space="preserve">La fondation cherche à élargir son réseau de porteurs et à faire émerger de nouveaux acteurs sur la façade.</w:t>
+              <w:t xml:space="preserve">L’urgence d’une situation impose une réponse incompatible avec les délais d’un appel à projets.</w:t>
             </w:r>
           </w:p>
         </w:tc>

</xml_diff>